<commit_message>
Tổng hợp bàn giao anh Tune: thêm commit tìm DO (64ce7a4) và phiếu thu/chi WEB (06a14189)
Co-Authored-By: Claude Opus 5.5 (1M context) <noreply@anthropic.com>
</commit_message>
<xml_diff>
--- a/DOCS/word/TONG_HOP_BAN_GIAO_ANH_TUNE.docx
+++ b/DOCS/word/TONG_HOP_BAN_GIAO_ANH_TUNE.docx
@@ -1016,6 +1016,154 @@
             </w:r>
             <w:r>
               <w:t xml:space="preserve"> NULL).</w:t>
+            </w:r>
+          </w:p>
+        </w:tc>
+      </w:tr>
+      <w:tr>
+        <w:tc>
+          <w:tcPr>
+            <w:tcW w:type="dxa" w:w="2160"/>
+          </w:tcPr>
+          <w:p>
+            <w:r/>
+            <w:r>
+              <w:t>GLS-QLSX-APIs</w:t>
+            </w:r>
+          </w:p>
+        </w:tc>
+        <w:tc>
+          <w:tcPr>
+            <w:tcW w:type="dxa" w:w="2160"/>
+          </w:tcPr>
+          <w:p>
+            <w:r/>
+            <w:r>
+              <w:rPr>
+                <w:rFonts w:ascii="Consolas" w:hAnsi="Consolas"/>
+                <w:sz w:val="19"/>
+              </w:rPr>
+              <w:t>feat/HonTunedaHai</w:t>
+            </w:r>
+          </w:p>
+        </w:tc>
+        <w:tc>
+          <w:tcPr>
+            <w:tcW w:type="dxa" w:w="2160"/>
+          </w:tcPr>
+          <w:p>
+            <w:r/>
+            <w:r>
+              <w:rPr>
+                <w:rFonts w:ascii="Consolas" w:hAnsi="Consolas"/>
+                <w:sz w:val="19"/>
+              </w:rPr>
+              <w:t>64ce7a4</w:t>
+            </w:r>
+          </w:p>
+        </w:tc>
+        <w:tc>
+          <w:tcPr>
+            <w:tcW w:type="dxa" w:w="2160"/>
+          </w:tcPr>
+          <w:p>
+            <w:r/>
+            <w:r>
+              <w:t xml:space="preserve">Vụ việc: có từ khoá thì gửi </w:t>
+            </w:r>
+            <w:r>
+              <w:rPr>
+                <w:rFonts w:ascii="Consolas" w:hAnsi="Consolas"/>
+                <w:sz w:val="19"/>
+              </w:rPr>
+              <w:t>q</w:t>
+            </w:r>
+            <w:r>
+              <w:t xml:space="preserve"> sang trang điều xe, tìm trên toàn bộ DO, Total đúng sau lọc; nguồn cũ thì lọc trong trang như trước.</w:t>
+            </w:r>
+          </w:p>
+        </w:tc>
+      </w:tr>
+      <w:tr>
+        <w:tc>
+          <w:tcPr>
+            <w:tcW w:type="dxa" w:w="2160"/>
+          </w:tcPr>
+          <w:p>
+            <w:r/>
+            <w:r>
+              <w:t>GLS-QLSX-Web</w:t>
+            </w:r>
+          </w:p>
+        </w:tc>
+        <w:tc>
+          <w:tcPr>
+            <w:tcW w:type="dxa" w:w="2160"/>
+          </w:tcPr>
+          <w:p>
+            <w:r/>
+            <w:r>
+              <w:rPr>
+                <w:rFonts w:ascii="Consolas" w:hAnsi="Consolas"/>
+                <w:sz w:val="19"/>
+              </w:rPr>
+              <w:t>feat/hontunedhai_Laos</w:t>
+            </w:r>
+          </w:p>
+        </w:tc>
+        <w:tc>
+          <w:tcPr>
+            <w:tcW w:type="dxa" w:w="2160"/>
+          </w:tcPr>
+          <w:p>
+            <w:r/>
+            <w:r>
+              <w:rPr>
+                <w:rFonts w:ascii="Consolas" w:hAnsi="Consolas"/>
+                <w:sz w:val="19"/>
+              </w:rPr>
+              <w:t>06a14189</w:t>
+            </w:r>
+          </w:p>
+        </w:tc>
+        <w:tc>
+          <w:tcPr>
+            <w:tcW w:type="dxa" w:w="2160"/>
+          </w:tcPr>
+          <w:p>
+            <w:r/>
+            <w:r>
+              <w:t xml:space="preserve">Phiếu thu / chi: </w:t>
+            </w:r>
+            <w:r>
+              <w:rPr>
+                <w:rFonts w:ascii="Consolas" w:hAnsi="Consolas"/>
+                <w:sz w:val="19"/>
+              </w:rPr>
+              <w:t>isCash</w:t>
+            </w:r>
+            <w:r>
+              <w:t xml:space="preserve"> theo hình thức thanh toán, tài khoản tiền mặc định tự điền đúng (gửi kèm loại tiền); </w:t>
+            </w:r>
+            <w:r>
+              <w:rPr>
+                <w:rFonts w:ascii="Consolas" w:hAnsi="Consolas"/>
+                <w:sz w:val="19"/>
+              </w:rPr>
+              <w:t>Amount</w:t>
+            </w:r>
+            <w:r>
+              <w:t xml:space="preserve"> / </w:t>
+            </w:r>
+            <w:r>
+              <w:rPr>
+                <w:rFonts w:ascii="Consolas" w:hAnsi="Consolas"/>
+                <w:sz w:val="19"/>
+              </w:rPr>
+              <w:t>BaseAmount</w:t>
+            </w:r>
+            <w:r>
+              <w:t xml:space="preserve"> header tách đúng nguyên tệ / quy đổi; phân loại theo mã loại chứng từ, không theo tên. Sửa mục 9 câu 1 · 2 · 6 tài liệu của anh.</w:t>
             </w:r>
           </w:p>
         </w:tc>

</xml_diff>

<commit_message>
Tài liệu anh Tune (bên EPL): viết lại theo hiện trạng, khớp SoT anh Tune và quyết định cắt sổ 01/10
Hợp đồng · Nối API · Tổng hợp bàn giao (+ Word): API ce95b3c, Web 7e14421c; bỏ phần tiền trang tạm, 8030 chỉ là kho tạm,
số tiền trang tạm là số thử; cắt sổ 01/10, bỏ luật DA_HOA_DON_TRANG_TAM; khoản qua tiền → phiếu chi / thu bên anh Tune,
khoản không qua tiền → bút toán chờ (đang làm); hai SO thử nhờ anh Tune huỷ. Bỏ kiểu nhật ký đổi phiên bản.

Co-Authored-By: Claude Opus 5.5 (1M context) <noreply@anthropic.com>
</commit_message>
<xml_diff>
--- a/DOCS/word/TONG_HOP_BAN_GIAO_ANH_TUNE.docx
+++ b/DOCS/word/TONG_HOP_BAN_GIAO_ANH_TUNE.docx
@@ -70,7 +70,41 @@
         <w:t>HOP_DONG_API_KE_TOAN_ANH_TUNE</w:t>
       </w:r>
       <w:r>
-        <w:t xml:space="preserve"> (mục 8, 10, 12.9 – 12.12);</w:t>
+        <w:t xml:space="preserve"> (mục 0.1, 5, 8, 10, 12.9 – 12.12);</w:t>
+      </w:r>
+    </w:p>
+    <w:p>
+      <w:pPr>
+        <w:pStyle w:val="ListBullet"/>
+      </w:pPr>
+      <w:r>
+        <w:t xml:space="preserve">bản đồ nối </w:t>
+      </w:r>
+      <w:r>
+        <w:rPr>
+          <w:b/>
+        </w:rPr>
+        <w:t>NOI_API_ANH_TUNE</w:t>
+      </w:r>
+      <w:r>
+        <w:t>;</w:t>
+      </w:r>
+    </w:p>
+    <w:p>
+      <w:pPr>
+        <w:pStyle w:val="ListBullet"/>
+      </w:pPr>
+      <w:r>
+        <w:t xml:space="preserve">hướng dẫn triển khai </w:t>
+      </w:r>
+      <w:r>
+        <w:rPr>
+          <w:b/>
+        </w:rPr>
+        <w:t>HUONG_DAN_TRIEN_KHAI_ANH_TUNE</w:t>
+      </w:r>
+      <w:r>
+        <w:t xml:space="preserve"> (các bước đổi link, kiểm sau triển khai);</w:t>
       </w:r>
     </w:p>
     <w:p>
@@ -87,7 +121,7 @@
         <w:t>16</w:t>
       </w:r>
       <w:r>
-        <w:t xml:space="preserve"> trong tài liệu tổng hợp của anh: </w:t>
+        <w:t xml:space="preserve"> trong tài liệu hiện trạng của anh: </w:t>
       </w:r>
       <w:r>
         <w:rPr>
@@ -105,7 +139,27 @@
         <w:jc w:val="both"/>
       </w:pPr>
       <w:r>
-        <w:t xml:space="preserve">Mọi thứ dưới đây bên em thử trên </w:t>
+        <w:t xml:space="preserve">Source của anh đang đối chiếu: API </w:t>
+      </w:r>
+      <w:r>
+        <w:rPr>
+          <w:rFonts w:ascii="Consolas" w:hAnsi="Consolas"/>
+          <w:sz w:val="19"/>
+        </w:rPr>
+        <w:t>feat/HonTunedaHai@ce95b3c</w:t>
+      </w:r>
+      <w:r>
+        <w:t xml:space="preserve">, WEB </w:t>
+      </w:r>
+      <w:r>
+        <w:rPr>
+          <w:rFonts w:ascii="Consolas" w:hAnsi="Consolas"/>
+          <w:sz w:val="19"/>
+        </w:rPr>
+        <w:t>feat/hontunedhai_Laos@7e14421c</w:t>
+      </w:r>
+      <w:r>
+        <w:t xml:space="preserve">. Mọi thứ dưới đây bên em thử trên </w:t>
       </w:r>
       <w:r>
         <w:rPr>
@@ -124,7 +178,7 @@
         <w:t>demo-lao-api.goldensme.com</w:t>
       </w:r>
       <w:r>
-        <w:t xml:space="preserve"> chưa merge code mới. Anh triển khai xong thì đổi link theo mục 4.</w:t>
+        <w:t xml:space="preserve"> chưa merge code hai nhánh; anh triển khai xong thì đổi link theo mục 4.</w:t>
       </w:r>
     </w:p>
     <w:p>
@@ -135,7 +189,180 @@
         <w:rPr>
           <w:color w:val="145C4A"/>
         </w:rPr>
-        <w:t>1. Các luồng đã nối</w:t>
+        <w:t>0. Ranh giới tiền (chủ dự án chốt 01/10/2026)</w:t>
+      </w:r>
+    </w:p>
+    <w:p>
+      <w:pPr>
+        <w:pStyle w:val="ListBullet"/>
+      </w:pPr>
+      <w:r>
+        <w:rPr>
+          <w:b/>
+        </w:rPr>
+        <w:t>Bỏ phần tiền của trang kế toán tạm</w:t>
+      </w:r>
+      <w:r>
+        <w:t xml:space="preserve"> </w:t>
+      </w:r>
+      <w:r>
+        <w:rPr>
+          <w:rFonts w:ascii="Consolas" w:hAnsi="Consolas"/>
+          <w:sz w:val="19"/>
+        </w:rPr>
+        <w:t>EPL_KETOAN</w:t>
+      </w:r>
+      <w:r>
+        <w:t xml:space="preserve"> (cổng 8030). Trang đó chỉ còn là </w:t>
+      </w:r>
+      <w:r>
+        <w:rPr>
+          <w:b/>
+        </w:rPr>
+        <w:t>kho tạm</w:t>
+      </w:r>
+      <w:r>
+        <w:t>, tới khi nối hệ kho của anh Toàn.</w:t>
+      </w:r>
+    </w:p>
+    <w:p>
+      <w:pPr>
+        <w:pStyle w:val="ListBullet"/>
+      </w:pPr>
+      <w:r>
+        <w:rPr>
+          <w:b/>
+        </w:rPr>
+        <w:t>Số tiền trên trang kế toán tạm là số thử, bỏ hết</w:t>
+      </w:r>
+      <w:r>
+        <w:t>: hoá đơn, lần thu, đợt trả chủ xe, tất toán, trả nhà cung cấp, cấn trừ ở đó không mang sang.</w:t>
+      </w:r>
+    </w:p>
+    <w:p>
+      <w:pPr>
+        <w:pStyle w:val="ListBullet"/>
+      </w:pPr>
+      <w:r>
+        <w:rPr>
+          <w:b/>
+        </w:rPr>
+        <w:t>Cắt sổ 01/10:</w:t>
+      </w:r>
+      <w:r>
+        <w:t xml:space="preserve"> mọi DO đã khoá đều gửi SO sang hệ anh </w:t>
+      </w:r>
+      <w:r>
+        <w:rPr>
+          <w:b/>
+        </w:rPr>
+        <w:t>từ đầu</w:t>
+      </w:r>
+      <w:r>
+        <w:t xml:space="preserve">. Trang điều xe không còn chặn DO đã có hoá đơn / đã thu ở trang tạm; luật </w:t>
+      </w:r>
+      <w:r>
+        <w:rPr>
+          <w:rFonts w:ascii="Consolas" w:hAnsi="Consolas"/>
+          <w:sz w:val="19"/>
+        </w:rPr>
+        <w:t>DA_HOA_DON_TRANG_TAM</w:t>
+      </w:r>
+      <w:r>
+        <w:t xml:space="preserve"> đã bỏ.</w:t>
+      </w:r>
+    </w:p>
+    <w:p>
+      <w:pPr>
+        <w:pStyle w:val="ListBullet"/>
+      </w:pPr>
+      <w:r>
+        <w:rPr>
+          <w:b/>
+        </w:rPr>
+        <w:t>Khoản đi qua tiền</w:t>
+      </w:r>
+      <w:r>
+        <w:t xml:space="preserve"> thành </w:t>
+      </w:r>
+      <w:r>
+        <w:rPr>
+          <w:b/>
+        </w:rPr>
+        <w:t>phiếu chi / phiếu thu bên anh</w:t>
+      </w:r>
+      <w:r>
+        <w:t xml:space="preserve">. Thủ quỹ bên anh chi / thu rồi </w:t>
+      </w:r>
+      <w:r>
+        <w:rPr>
+          <w:b/>
+        </w:rPr>
+        <w:t>ghi sổ</w:t>
+      </w:r>
+      <w:r>
+        <w:t>, trang điều xe đọc lại trạng thái.</w:t>
+      </w:r>
+    </w:p>
+    <w:p>
+      <w:pPr>
+        <w:pStyle w:val="ListBullet"/>
+      </w:pPr>
+      <w:r>
+        <w:rPr>
+          <w:b/>
+        </w:rPr>
+        <w:t>Khoản không qua tiền</w:t>
+      </w:r>
+      <w:r>
+        <w:t xml:space="preserve"> thành </w:t>
+      </w:r>
+      <w:r>
+        <w:rPr>
+          <w:b/>
+        </w:rPr>
+        <w:t>bút toán chờ gửi</w:t>
+      </w:r>
+      <w:r>
+        <w:t xml:space="preserve"> ở trang điều xe, đủ hai vế từng dòng bằng mã thật. Bên em giữ cho tới khi hệ anh có API bút toán (mục 5).</w:t>
+      </w:r>
+    </w:p>
+    <w:p>
+      <w:pPr>
+        <w:pStyle w:val="ListBullet"/>
+      </w:pPr>
+      <w:r>
+        <w:t xml:space="preserve">Trang điều xe </w:t>
+      </w:r>
+      <w:r>
+        <w:rPr>
+          <w:b/>
+        </w:rPr>
+        <w:t>thôi đẩy phong bì chứng từ</w:t>
+      </w:r>
+      <w:r>
+        <w:t xml:space="preserve"> </w:t>
+      </w:r>
+      <w:r>
+        <w:rPr>
+          <w:rFonts w:ascii="Consolas" w:hAnsi="Consolas"/>
+          <w:sz w:val="19"/>
+        </w:rPr>
+        <w:t>POST /api/v1/epl-lao/vouchers</w:t>
+      </w:r>
+      <w:r>
+        <w:t>. Hệ anh không cần dựng cửa đó.</w:t>
+      </w:r>
+    </w:p>
+    <w:p>
+      <w:pPr>
+        <w:pStyle w:val="Heading1"/>
+      </w:pPr>
+      <w:r>
+        <w:rPr>
+          <w:color w:val="145C4A"/>
+        </w:rPr>
+        <w:t>1. Các luồng</w:t>
       </w:r>
     </w:p>
     <w:tbl>
@@ -266,7 +493,7 @@
                 <w:rFonts w:ascii="Consolas" w:hAnsi="Consolas"/>
                 <w:sz w:val="19"/>
               </w:rPr>
-              <w:t>/api/handover/…</w:t>
+              <w:t>/api/handover/delivery-orders</w:t>
             </w:r>
           </w:p>
         </w:tc>
@@ -288,7 +515,17 @@
           <w:p>
             <w:r/>
             <w:r>
-              <w:t>đã sửa source (mục 2), chạy ở máy</w:t>
+              <w:t>chạy ở máy (</w:t>
+            </w:r>
+            <w:r>
+              <w:rPr>
+                <w:rFonts w:ascii="Consolas" w:hAnsi="Consolas"/>
+                <w:sz w:val="19"/>
+              </w:rPr>
+              <w:t>ce95b3c</w:t>
+            </w:r>
+            <w:r>
+              <w:t>)</w:t>
             </w:r>
           </w:p>
         </w:tc>
@@ -344,24 +581,7 @@
           <w:p>
             <w:r/>
             <w:r>
-              <w:t xml:space="preserve">đã tạo thật </w:t>
-            </w:r>
-            <w:r>
-              <w:rPr>
-                <w:rFonts w:ascii="Consolas" w:hAnsi="Consolas"/>
-                <w:sz w:val="19"/>
-              </w:rPr>
-              <w:t>TK-20261001-000162</w:t>
-            </w:r>
-            <w:r>
-              <w:t xml:space="preserve">, </w:t>
-            </w:r>
-            <w:r>
-              <w:rPr>
-                <w:rFonts w:ascii="Consolas" w:hAnsi="Consolas"/>
-                <w:sz w:val="19"/>
-              </w:rPr>
-              <w:t>…163</w:t>
+              <w:t>chạy ở máy; mọi DO đã khoá gửi được</w:t>
             </w:r>
           </w:p>
         </w:tc>
@@ -411,7 +631,7 @@
           <w:p>
             <w:r/>
             <w:r>
-              <w:t xml:space="preserve">khách </w:t>
+              <w:t xml:space="preserve">chạy: khách </w:t>
             </w:r>
             <w:r>
               <w:rPr>
@@ -439,6 +659,16 @@
                 <w:sz w:val="19"/>
               </w:rPr>
               <w:t>EPLTX-…</w:t>
+            </w:r>
+            <w:r>
+              <w:t xml:space="preserve">, nhà cung cấp </w:t>
+            </w:r>
+            <w:r>
+              <w:rPr>
+                <w:rFonts w:ascii="Consolas" w:hAnsi="Consolas"/>
+                <w:sz w:val="19"/>
+              </w:rPr>
+              <w:t>EPLNCC-…</w:t>
             </w:r>
           </w:p>
         </w:tc>
@@ -497,7 +727,7 @@
           <w:p>
             <w:r/>
             <w:r>
-              <w:t>chạy thật; ghi sổ xong (STATUS 12/13) thì xe mới xuất phát</w:t>
+              <w:t>chạy; ghi sổ xong (STATUS 12/13) thì xe mới xuất phát</w:t>
             </w:r>
           </w:p>
         </w:tc>
@@ -549,7 +779,7 @@
           <w:p>
             <w:r/>
             <w:r>
-              <w:t>chạy thật sau khi mở 4022</w:t>
+              <w:t>chạy</w:t>
             </w:r>
           </w:p>
         </w:tc>
@@ -580,7 +810,7 @@
                 <w:rFonts w:ascii="Consolas" w:hAnsi="Consolas"/>
                 <w:sz w:val="19"/>
               </w:rPr>
-              <w:t>cmpayment-receipt/save-and-commit</w:t>
+              <w:t>save-and-commit</w:t>
             </w:r>
             <w:r>
               <w:t>, "Chi khác" (DOTY 60)</w:t>
@@ -605,7 +835,7 @@
           <w:p>
             <w:r/>
             <w:r>
-              <w:t>chạy thật; ghi sổ xong thì phiếu xe thành "đã trả chủ xe"</w:t>
+              <w:t>chạy; ghi sổ xong thì phiếu xe "đã trả chủ xe"</w:t>
             </w:r>
           </w:p>
         </w:tc>
@@ -618,7 +848,13 @@
           <w:p>
             <w:r/>
             <w:r>
-              <w:t>Đọc lại trạng thái phiếu chi</w:t>
+              <w:rPr>
+                <w:b/>
+              </w:rPr>
+              <w:t>Chi mục V – VI</w:t>
+            </w:r>
+            <w:r>
+              <w:t xml:space="preserve"> (dòng quỹ trả ngay; thực tế chỉ mục V có)</w:t>
             </w:r>
           </w:p>
         </w:tc>
@@ -633,17 +869,10 @@
                 <w:rFonts w:ascii="Consolas" w:hAnsi="Consolas"/>
                 <w:sz w:val="19"/>
               </w:rPr>
-              <w:t>cmpayment-receipt/list</w:t>
-            </w:r>
-            <w:r>
-              <w:t xml:space="preserve">, </w:t>
-            </w:r>
-            <w:r>
-              <w:rPr>
-                <w:rFonts w:ascii="Consolas" w:hAnsi="Consolas"/>
-                <w:sz w:val="19"/>
-              </w:rPr>
-              <w:t>/{id}</w:t>
+              <w:t>save-and-commit</w:t>
+            </w:r>
+            <w:r>
+              <w:t>, "Chi khác" (DOTY 60)</w:t>
             </w:r>
           </w:p>
         </w:tc>
@@ -654,7 +883,7 @@
           <w:p>
             <w:r/>
             <w:r>
-              <w:t>—</w:t>
+              <w:t>xe nhà Nợ 614 (V) · 625 (VI) / Có 1011 · xe thuê Nợ 4022 / Có 1011</w:t>
             </w:r>
           </w:p>
         </w:tc>
@@ -665,7 +894,10 @@
           <w:p>
             <w:r/>
             <w:r>
-              <w:t>tự đọc lúc mở phiếu và trước khi cho xe chạy</w:t>
+              <w:rPr>
+                <w:b/>
+              </w:rPr>
+              <w:t>đang làm</w:t>
             </w:r>
           </w:p>
         </w:tc>
@@ -681,10 +913,10 @@
               <w:rPr>
                 <w:b/>
               </w:rPr>
-              <w:t>Công nợ khách</w:t>
-            </w:r>
-            <w:r>
-              <w:t xml:space="preserve"> (chỉ xem)</w:t>
+              <w:t>Tất toán tài xế</w:t>
+            </w:r>
+            <w:r>
+              <w:t>: chi bù / thu hoàn</w:t>
             </w:r>
           </w:p>
         </w:tc>
@@ -699,7 +931,10 @@
                 <w:rFonts w:ascii="Consolas" w:hAnsi="Consolas"/>
                 <w:sz w:val="19"/>
               </w:rPr>
-              <w:t>sales/debt/customer-detail</w:t>
+              <w:t>save-and-commit</w:t>
+            </w:r>
+            <w:r>
+              <w:t xml:space="preserve"> CMP "Chi khác" (60) · CMR "Thu khác" (17)</w:t>
             </w:r>
           </w:p>
         </w:tc>
@@ -710,7 +945,7 @@
           <w:p>
             <w:r/>
             <w:r>
-              <w:t>—</w:t>
+              <w:t>Nợ 1601 / Có tiền · Nợ tiền / Có 1601</w:t>
             </w:r>
           </w:p>
         </w:tc>
@@ -721,7 +956,10 @@
           <w:p>
             <w:r/>
             <w:r>
-              <w:t>màn Khách hàng → tab Công nợ</w:t>
+              <w:rPr>
+                <w:b/>
+              </w:rPr>
+              <w:t>đang làm</w:t>
             </w:r>
           </w:p>
         </w:tc>
@@ -734,7 +972,10 @@
           <w:p>
             <w:r/>
             <w:r>
-              <w:t>Rút phiếu chi chưa ghi sổ (xoá phiếu / huỷ đề nghị)</w:t>
+              <w:rPr>
+                <w:b/>
+              </w:rPr>
+              <w:t>Trả nhà cung cấp</w:t>
             </w:r>
           </w:p>
         </w:tc>
@@ -749,7 +990,10 @@
                 <w:rFonts w:ascii="Consolas" w:hAnsi="Consolas"/>
                 <w:sz w:val="19"/>
               </w:rPr>
-              <w:t>cmpayment-receipt/delete</w:t>
+              <w:t>save-and-commit</w:t>
+            </w:r>
+            <w:r>
+              <w:t>, "Chi khác" (DOTY 60)</w:t>
             </w:r>
           </w:p>
         </w:tc>
@@ -760,7 +1004,7 @@
           <w:p>
             <w:r/>
             <w:r>
-              <w:t>—</w:t>
+              <w:t>Nợ 4021 / Có tiền</w:t>
             </w:r>
           </w:p>
         </w:tc>
@@ -771,13 +1015,295 @@
           <w:p>
             <w:r/>
             <w:r>
-              <w:t>ghi sổ rồi thì không rút, báo đối soát</w:t>
+              <w:rPr>
+                <w:b/>
+              </w:rPr>
+              <w:t>đang làm</w:t>
+            </w:r>
+          </w:p>
+        </w:tc>
+      </w:tr>
+      <w:tr>
+        <w:tc>
+          <w:tcPr>
+            <w:tcW w:type="dxa" w:w="2160"/>
+          </w:tcPr>
+          <w:p>
+            <w:r/>
+            <w:r>
+              <w:rPr>
+                <w:b/>
+              </w:rPr>
+              <w:t>Bút toán chờ gửi</w:t>
+            </w:r>
+            <w:r>
+              <w:t xml:space="preserve"> (không qua tiền)</w:t>
+            </w:r>
+          </w:p>
+        </w:tc>
+        <w:tc>
+          <w:tcPr>
+            <w:tcW w:type="dxa" w:w="2160"/>
+          </w:tcPr>
+          <w:p>
+            <w:r/>
+            <w:r>
+              <w:t>chưa có đường bên anh</w:t>
+            </w:r>
+          </w:p>
+        </w:tc>
+        <w:tc>
+          <w:tcPr>
+            <w:tcW w:type="dxa" w:w="2160"/>
+          </w:tcPr>
+          <w:p>
+            <w:r/>
+            <w:r>
+              <w:t>thuê xe 621/4022 · ghi nợ NCC 625 · 614 / 4021 · quyết toán tạm ứng 625/1601</w:t>
+            </w:r>
+          </w:p>
+        </w:tc>
+        <w:tc>
+          <w:tcPr>
+            <w:tcW w:type="dxa" w:w="2160"/>
+          </w:tcPr>
+          <w:p>
+            <w:r/>
+            <w:r>
+              <w:rPr>
+                <w:b/>
+              </w:rPr>
+              <w:t>đang làm</w:t>
+            </w:r>
+            <w:r>
+              <w:t xml:space="preserve"> ở trang điều xe; chờ API bút toán</w:t>
+            </w:r>
+          </w:p>
+        </w:tc>
+      </w:tr>
+      <w:tr>
+        <w:tc>
+          <w:tcPr>
+            <w:tcW w:type="dxa" w:w="2160"/>
+          </w:tcPr>
+          <w:p>
+            <w:r/>
+            <w:r>
+              <w:t>Đọc lại trạng thái phiếu chi / thu</w:t>
+            </w:r>
+          </w:p>
+        </w:tc>
+        <w:tc>
+          <w:tcPr>
+            <w:tcW w:type="dxa" w:w="2160"/>
+          </w:tcPr>
+          <w:p>
+            <w:r/>
+            <w:r>
+              <w:rPr>
+                <w:rFonts w:ascii="Consolas" w:hAnsi="Consolas"/>
+                <w:sz w:val="19"/>
+              </w:rPr>
+              <w:t>cmpayment-receipt/list</w:t>
+            </w:r>
+            <w:r>
+              <w:t xml:space="preserve">, </w:t>
+            </w:r>
+            <w:r>
+              <w:rPr>
+                <w:rFonts w:ascii="Consolas" w:hAnsi="Consolas"/>
+                <w:sz w:val="19"/>
+              </w:rPr>
+              <w:t>/{id}</w:t>
+            </w:r>
+          </w:p>
+        </w:tc>
+        <w:tc>
+          <w:tcPr>
+            <w:tcW w:type="dxa" w:w="2160"/>
+          </w:tcPr>
+          <w:p>
+            <w:r/>
+            <w:r>
+              <w:t>—</w:t>
+            </w:r>
+          </w:p>
+        </w:tc>
+        <w:tc>
+          <w:tcPr>
+            <w:tcW w:type="dxa" w:w="2160"/>
+          </w:tcPr>
+          <w:p>
+            <w:r/>
+            <w:r>
+              <w:t>tự đọc lúc mở phiếu, trước khi cho xe chạy, khi bấm Cập nhật</w:t>
+            </w:r>
+          </w:p>
+        </w:tc>
+      </w:tr>
+      <w:tr>
+        <w:tc>
+          <w:tcPr>
+            <w:tcW w:type="dxa" w:w="2160"/>
+          </w:tcPr>
+          <w:p>
+            <w:r/>
+            <w:r>
+              <w:rPr>
+                <w:b/>
+              </w:rPr>
+              <w:t>Công nợ khách</w:t>
+            </w:r>
+            <w:r>
+              <w:t>, "đã thu" của từng SO (chỉ xem)</w:t>
+            </w:r>
+          </w:p>
+        </w:tc>
+        <w:tc>
+          <w:tcPr>
+            <w:tcW w:type="dxa" w:w="2160"/>
+          </w:tcPr>
+          <w:p>
+            <w:r/>
+            <w:r>
+              <w:rPr>
+                <w:rFonts w:ascii="Consolas" w:hAnsi="Consolas"/>
+                <w:sz w:val="19"/>
+              </w:rPr>
+              <w:t>sales/debt/customer-detail</w:t>
+            </w:r>
+          </w:p>
+        </w:tc>
+        <w:tc>
+          <w:tcPr>
+            <w:tcW w:type="dxa" w:w="2160"/>
+          </w:tcPr>
+          <w:p>
+            <w:r/>
+            <w:r>
+              <w:t>—</w:t>
+            </w:r>
+          </w:p>
+        </w:tc>
+        <w:tc>
+          <w:tcPr>
+            <w:tcW w:type="dxa" w:w="2160"/>
+          </w:tcPr>
+          <w:p>
+            <w:r/>
+            <w:r>
+              <w:t xml:space="preserve">màn Khách hàng → tab Công nợ; đề nghị thu đọc "thu một phần / đã thu" theo </w:t>
+            </w:r>
+            <w:r>
+              <w:rPr>
+                <w:rFonts w:ascii="Consolas" w:hAnsi="Consolas"/>
+                <w:sz w:val="19"/>
+              </w:rPr>
+              <w:t>OrderCode</w:t>
+            </w:r>
+          </w:p>
+        </w:tc>
+      </w:tr>
+      <w:tr>
+        <w:tc>
+          <w:tcPr>
+            <w:tcW w:type="dxa" w:w="2160"/>
+          </w:tcPr>
+          <w:p>
+            <w:r/>
+            <w:r>
+              <w:t>Rút phiếu chưa ghi sổ (xoá phiếu / huỷ đề nghị)</w:t>
+            </w:r>
+          </w:p>
+        </w:tc>
+        <w:tc>
+          <w:tcPr>
+            <w:tcW w:type="dxa" w:w="2160"/>
+          </w:tcPr>
+          <w:p>
+            <w:r/>
+            <w:r>
+              <w:rPr>
+                <w:rFonts w:ascii="Consolas" w:hAnsi="Consolas"/>
+                <w:sz w:val="19"/>
+              </w:rPr>
+              <w:t>cmpayment-receipt/delete</w:t>
+            </w:r>
+          </w:p>
+        </w:tc>
+        <w:tc>
+          <w:tcPr>
+            <w:tcW w:type="dxa" w:w="2160"/>
+          </w:tcPr>
+          <w:p>
+            <w:r/>
+            <w:r>
+              <w:t>—</w:t>
+            </w:r>
+          </w:p>
+        </w:tc>
+        <w:tc>
+          <w:tcPr>
+            <w:tcW w:type="dxa" w:w="2160"/>
+          </w:tcPr>
+          <w:p>
+            <w:r/>
+            <w:r>
+              <w:t>đã ghi sổ thì không rút, báo đối soát</w:t>
             </w:r>
           </w:p>
         </w:tc>
       </w:tr>
     </w:tbl>
     <w:p/>
+    <w:p>
+      <w:pPr>
+        <w:jc w:val="both"/>
+      </w:pPr>
+      <w:r>
+        <w:t xml:space="preserve">Phiếu bên em gửi vẫn mang </w:t>
+      </w:r>
+      <w:r>
+        <w:rPr>
+          <w:rFonts w:ascii="Consolas" w:hAnsi="Consolas"/>
+          <w:sz w:val="19"/>
+        </w:rPr>
+        <w:t>Header.Amount</w:t>
+      </w:r>
+      <w:r>
+        <w:t xml:space="preserve"> / </w:t>
+      </w:r>
+      <w:r>
+        <w:rPr>
+          <w:rFonts w:ascii="Consolas" w:hAnsi="Consolas"/>
+          <w:sz w:val="19"/>
+        </w:rPr>
+        <w:t>Header.BaseAmount</w:t>
+      </w:r>
+      <w:r>
+        <w:t xml:space="preserve"> = tổng các dòng. Từ </w:t>
+      </w:r>
+      <w:r>
+        <w:rPr>
+          <w:rFonts w:ascii="Consolas" w:hAnsi="Consolas"/>
+          <w:sz w:val="19"/>
+        </w:rPr>
+        <w:t>ce95b3c</w:t>
+      </w:r>
+      <w:r>
+        <w:t xml:space="preserve">, hệ anh tự tính lại tổng header từ </w:t>
+      </w:r>
+      <w:r>
+        <w:rPr>
+          <w:rFonts w:ascii="Consolas" w:hAnsi="Consolas"/>
+          <w:sz w:val="19"/>
+        </w:rPr>
+        <w:t>Entries</w:t>
+      </w:r>
+      <w:r>
+        <w:t xml:space="preserve"> (5 số lẻ, làm tròn nửa xa số 0), nên số header bên em không có thẩm quyền.</w:t>
+      </w:r>
+    </w:p>
     <w:p>
       <w:pPr>
         <w:pStyle w:val="Heading1"/>
@@ -934,7 +1460,17 @@
               <w:t>LogisticsSource</w:t>
             </w:r>
             <w:r>
-              <w:t xml:space="preserve"> (bỏ ghi cứng). DO hiện số phiếu, tên khách; tìm theo số xe, biển số.</w:t>
+              <w:t xml:space="preserve">, gửi </w:t>
+            </w:r>
+            <w:r>
+              <w:rPr>
+                <w:rFonts w:ascii="Consolas" w:hAnsi="Consolas"/>
+                <w:sz w:val="19"/>
+              </w:rPr>
+              <w:t>Authorization</w:t>
+            </w:r>
+            <w:r>
+              <w:t>. DO hiện số phiếu, tên khách; tìm theo số xe, biển số.</w:t>
             </w:r>
           </w:p>
         </w:tc>
@@ -1079,7 +1615,17 @@
               <w:t>q</w:t>
             </w:r>
             <w:r>
-              <w:t xml:space="preserve"> sang trang điều xe, tìm trên toàn bộ DO, Total đúng sau lọc; nguồn cũ thì lọc trong trang như trước.</w:t>
+              <w:t xml:space="preserve"> sang trang điều xe, tìm trên toàn bộ DO, Total đúng sau lọc; nguồn không hiểu </w:t>
+            </w:r>
+            <w:r>
+              <w:rPr>
+                <w:rFonts w:ascii="Consolas" w:hAnsi="Consolas"/>
+                <w:sz w:val="19"/>
+              </w:rPr>
+              <w:t>q</w:t>
+            </w:r>
+            <w:r>
+              <w:t xml:space="preserve"> thì lọc trong trang.</w:t>
             </w:r>
           </w:p>
         </w:tc>
@@ -1092,7 +1638,7 @@
           <w:p>
             <w:r/>
             <w:r>
-              <w:t>GLS-QLSX-Web</w:t>
+              <w:t>GLS-QLSX-APIs</w:t>
             </w:r>
           </w:p>
         </w:tc>
@@ -1107,7 +1653,7 @@
                 <w:rFonts w:ascii="Consolas" w:hAnsi="Consolas"/>
                 <w:sz w:val="19"/>
               </w:rPr>
-              <w:t>feat/hontunedhai_Laos</w:t>
+              <w:t>feat/HonTunedaHai</w:t>
             </w:r>
           </w:p>
         </w:tc>
@@ -1122,7 +1668,7 @@
                 <w:rFonts w:ascii="Consolas" w:hAnsi="Consolas"/>
                 <w:sz w:val="19"/>
               </w:rPr>
-              <w:t>06a14189</w:t>
+              <w:t>ce95b3c</w:t>
             </w:r>
           </w:p>
         </w:tc>
@@ -1133,37 +1679,55 @@
           <w:p>
             <w:r/>
             <w:r>
-              <w:t xml:space="preserve">Phiếu thu / chi: </w:t>
+              <w:t xml:space="preserve">Theo chuẩn QLSX: </w:t>
             </w:r>
             <w:r>
               <w:rPr>
                 <w:rFonts w:ascii="Consolas" w:hAnsi="Consolas"/>
                 <w:sz w:val="19"/>
               </w:rPr>
-              <w:t>isCash</w:t>
-            </w:r>
-            <w:r>
-              <w:t xml:space="preserve"> theo hình thức thanh toán, tài khoản tiền mặc định tự điền đúng (gửi kèm loại tiền); </w:t>
+              <w:t>CashVoucherReferenceService</w:t>
+            </w:r>
+            <w:r>
+              <w:t xml:space="preserve"> + </w:t>
             </w:r>
             <w:r>
               <w:rPr>
                 <w:rFonts w:ascii="Consolas" w:hAnsi="Consolas"/>
                 <w:sz w:val="19"/>
               </w:rPr>
-              <w:t>Amount</w:t>
-            </w:r>
-            <w:r>
-              <w:t xml:space="preserve"> / </w:t>
+              <w:t>LogisticsDeliveryOrderClient</w:t>
+            </w:r>
+            <w:r>
+              <w:t xml:space="preserve">, controller chỉ còn HTTP / claims / envelope; contract typed; </w:t>
+            </w:r>
+            <w:r>
+              <w:rPr>
+                <w:b/>
+              </w:rPr>
+              <w:t>thiếu `LogisticsSource:BaseUrl` → 503</w:t>
+            </w:r>
+            <w:r>
+              <w:t xml:space="preserve">, không còn mặc định 1506. </w:t>
             </w:r>
             <w:r>
               <w:rPr>
                 <w:rFonts w:ascii="Consolas" w:hAnsi="Consolas"/>
                 <w:sz w:val="19"/>
               </w:rPr>
-              <w:t>BaseAmount</w:t>
-            </w:r>
-            <w:r>
-              <w:t xml:space="preserve"> header tách đúng nguyên tệ / quy đổi; phân loại theo mã loại chứng từ, không theo tên. Sửa mục 9 câu 1 · 2 · 6 tài liệu của anh.</w:t>
+              <w:t>CashVoucherHeaderTotals</w:t>
+            </w:r>
+            <w:r>
+              <w:t xml:space="preserve">: create / save / save-and-commit </w:t>
+            </w:r>
+            <w:r>
+              <w:rPr>
+                <w:b/>
+              </w:rPr>
+              <w:t>tự tính tổng header</w:t>
+            </w:r>
+            <w:r>
+              <w:t xml:space="preserve"> từ dòng. Dòng IV/IC hay công nợ thiếu số tiền thì giữ số header client gửi.</w:t>
             </w:r>
           </w:p>
         </w:tc>
@@ -1217,7 +1781,145 @@
           <w:p>
             <w:r/>
             <w:r>
-              <w:t>Modal Vụ việc: thoát ký tự chuỗi nguồn; DO hiện số phiếu, xe, tài xế; tỷ giá đọc xuôi.</w:t>
+              <w:t>Modal Vụ việc: thoát ký tự chuỗi DO; DO hiện số phiếu, xe, tài xế; tỷ giá nhỏ hơn 1 đọc xuôi.</w:t>
+            </w:r>
+          </w:p>
+        </w:tc>
+      </w:tr>
+      <w:tr>
+        <w:tc>
+          <w:tcPr>
+            <w:tcW w:type="dxa" w:w="2160"/>
+          </w:tcPr>
+          <w:p>
+            <w:r/>
+            <w:r>
+              <w:t>GLS-QLSX-Web</w:t>
+            </w:r>
+          </w:p>
+        </w:tc>
+        <w:tc>
+          <w:tcPr>
+            <w:tcW w:type="dxa" w:w="2160"/>
+          </w:tcPr>
+          <w:p>
+            <w:r/>
+            <w:r>
+              <w:rPr>
+                <w:rFonts w:ascii="Consolas" w:hAnsi="Consolas"/>
+                <w:sz w:val="19"/>
+              </w:rPr>
+              <w:t>feat/hontunedhai_Laos</w:t>
+            </w:r>
+          </w:p>
+        </w:tc>
+        <w:tc>
+          <w:tcPr>
+            <w:tcW w:type="dxa" w:w="2160"/>
+          </w:tcPr>
+          <w:p>
+            <w:r/>
+            <w:r>
+              <w:rPr>
+                <w:rFonts w:ascii="Consolas" w:hAnsi="Consolas"/>
+                <w:sz w:val="19"/>
+              </w:rPr>
+              <w:t>06a14189</w:t>
+            </w:r>
+          </w:p>
+        </w:tc>
+        <w:tc>
+          <w:tcPr>
+            <w:tcW w:type="dxa" w:w="2160"/>
+          </w:tcPr>
+          <w:p>
+            <w:r/>
+            <w:r>
+              <w:t xml:space="preserve">Phiếu thu / chi: </w:t>
+            </w:r>
+            <w:r>
+              <w:rPr>
+                <w:rFonts w:ascii="Consolas" w:hAnsi="Consolas"/>
+                <w:sz w:val="19"/>
+              </w:rPr>
+              <w:t>isCash</w:t>
+            </w:r>
+            <w:r>
+              <w:t xml:space="preserve"> theo hình thức thanh toán; tài khoản tiền mặc định đọc đúng </w:t>
+            </w:r>
+            <w:r>
+              <w:rPr>
+                <w:rFonts w:ascii="Consolas" w:hAnsi="Consolas"/>
+                <w:sz w:val="19"/>
+              </w:rPr>
+              <w:t>AccountCode</w:t>
+            </w:r>
+            <w:r>
+              <w:t>, gửi kèm loại tiền; tổng xem trước tách nguyên tệ / quy đổi; phân loại theo mã loại chứng từ, không theo tên.</w:t>
+            </w:r>
+          </w:p>
+        </w:tc>
+      </w:tr>
+      <w:tr>
+        <w:tc>
+          <w:tcPr>
+            <w:tcW w:type="dxa" w:w="2160"/>
+          </w:tcPr>
+          <w:p>
+            <w:r/>
+            <w:r>
+              <w:t>GLS-QLSX-Web</w:t>
+            </w:r>
+          </w:p>
+        </w:tc>
+        <w:tc>
+          <w:tcPr>
+            <w:tcW w:type="dxa" w:w="2160"/>
+          </w:tcPr>
+          <w:p>
+            <w:r/>
+            <w:r>
+              <w:rPr>
+                <w:rFonts w:ascii="Consolas" w:hAnsi="Consolas"/>
+                <w:sz w:val="19"/>
+              </w:rPr>
+              <w:t>feat/hontunedhai_Laos</w:t>
+            </w:r>
+          </w:p>
+        </w:tc>
+        <w:tc>
+          <w:tcPr>
+            <w:tcW w:type="dxa" w:w="2160"/>
+          </w:tcPr>
+          <w:p>
+            <w:r/>
+            <w:r>
+              <w:rPr>
+                <w:rFonts w:ascii="Consolas" w:hAnsi="Consolas"/>
+                <w:sz w:val="19"/>
+              </w:rPr>
+              <w:t>7e14421c</w:t>
+            </w:r>
+          </w:p>
+        </w:tc>
+        <w:tc>
+          <w:tcPr>
+            <w:tcW w:type="dxa" w:w="2160"/>
+          </w:tcPr>
+          <w:p>
+            <w:r/>
+            <w:r>
+              <w:t xml:space="preserve">Đổi hình thức thanh toán / nội tệ / loại tiền khi đã có dòng: vế tiền các dòng đổi theo tài khoản mặc định mới, dòng tự chọn giữ nguyên. Đổi quốc gia khi đã có dòng: chặn trước khi nạp danh mục. Mã DOTY gom một chỗ. Sửa câu </w:t>
+            </w:r>
+            <w:r>
+              <w:rPr>
+                <w:rFonts w:ascii="Consolas" w:hAnsi="Consolas"/>
+                <w:sz w:val="19"/>
+              </w:rPr>
+              <w:t>lo.json</w:t>
+            </w:r>
+            <w:r>
+              <w:t>.</w:t>
             </w:r>
           </w:p>
         </w:tc>
@@ -1324,7 +2026,37 @@
         <w:jc w:val="both"/>
       </w:pPr>
       <w:r>
-        <w:t>Quốc gia 11 nay có 497 mã. Trong hai repo không chỗ nào ghi cứng 137 / 402.</w:t>
+        <w:t xml:space="preserve">Quốc gia 11 nay có 497 mã. Trong hai repo không chỗ nào ghi cứng 137 / 402, ngoài tệp nạp </w:t>
+      </w:r>
+      <w:r>
+        <w:rPr>
+          <w:rFonts w:ascii="Consolas" w:hAnsi="Consolas"/>
+          <w:sz w:val="19"/>
+        </w:rPr>
+        <w:t>20260909_country_account_import_lao.sql</w:t>
+      </w:r>
+      <w:r>
+        <w:t xml:space="preserve">. Muốn trả lại: xoá 1371 / 4021 / 4022 khi chưa có bút toán, rồi </w:t>
+      </w:r>
+      <w:r>
+        <w:rPr>
+          <w:rFonts w:ascii="Consolas" w:hAnsi="Consolas"/>
+          <w:sz w:val="19"/>
+        </w:rPr>
+        <w:t>lao-accounts/update</w:t>
+      </w:r>
+      <w:r>
+        <w:t xml:space="preserve"> 137 / 402 với </w:t>
+      </w:r>
+      <w:r>
+        <w:rPr>
+          <w:rFonts w:ascii="Consolas" w:hAnsi="Consolas"/>
+          <w:sz w:val="19"/>
+        </w:rPr>
+        <w:t>Posting=true</w:t>
+      </w:r>
+      <w:r>
+        <w:t>.</w:t>
       </w:r>
     </w:p>
     <w:p>
@@ -1365,7 +2097,13 @@
         <w:pStyle w:val="ListBullet"/>
       </w:pPr>
       <w:r>
-        <w:t xml:space="preserve">Đối tượng </w:t>
+        <w:rPr>
+          <w:b/>
+        </w:rPr>
+        <w:t>Đối tượng</w:t>
+      </w:r>
+      <w:r>
+        <w:t xml:space="preserve"> </w:t>
       </w:r>
       <w:r>
         <w:rPr>
@@ -1395,7 +2133,114 @@
         <w:t>EPLTX-</w:t>
       </w:r>
       <w:r>
-        <w:t>, hai SO ở mục 1, các phiếu chi thử. Phiếu chi thử chưa ghi sổ đã được rút.</w:t>
+        <w:t xml:space="preserve"> / </w:t>
+      </w:r>
+      <w:r>
+        <w:rPr>
+          <w:rFonts w:ascii="Consolas" w:hAnsi="Consolas"/>
+          <w:sz w:val="19"/>
+        </w:rPr>
+        <w:t>EPLNCC-</w:t>
+      </w:r>
+      <w:r>
+        <w:t xml:space="preserve">; một tài xế thử </w:t>
+      </w:r>
+      <w:r>
+        <w:rPr>
+          <w:rFonts w:ascii="Consolas" w:hAnsi="Consolas"/>
+          <w:sz w:val="19"/>
+        </w:rPr>
+        <w:t>EPLTX-THU01</w:t>
+      </w:r>
+      <w:r>
+        <w:t>.</w:t>
+      </w:r>
+    </w:p>
+    <w:p>
+      <w:pPr>
+        <w:pStyle w:val="ListBullet"/>
+      </w:pPr>
+      <w:r>
+        <w:rPr>
+          <w:b/>
+        </w:rPr>
+        <w:t>Hai SO thử</w:t>
+      </w:r>
+      <w:r>
+        <w:t xml:space="preserve"> </w:t>
+      </w:r>
+      <w:r>
+        <w:rPr>
+          <w:rFonts w:ascii="Consolas" w:hAnsi="Consolas"/>
+          <w:sz w:val="19"/>
+        </w:rPr>
+        <w:t>TK-20261001-000162</w:t>
+      </w:r>
+      <w:r>
+        <w:t xml:space="preserve"> (ຄຳຕຸ້ຍ, 905,85 USD) và </w:t>
+      </w:r>
+      <w:r>
+        <w:rPr>
+          <w:rFonts w:ascii="Consolas" w:hAnsi="Consolas"/>
+          <w:sz w:val="19"/>
+        </w:rPr>
+        <w:t>TK-20261001-000163</w:t>
+      </w:r>
+      <w:r>
+        <w:t xml:space="preserve"> (ນາງ ວັນນາ, 1.676,90 USD) là </w:t>
+      </w:r>
+      <w:r>
+        <w:rPr>
+          <w:b/>
+        </w:rPr>
+        <w:t>dữ liệu thử, nhờ anh huỷ</w:t>
+      </w:r>
+      <w:r>
+        <w:t>.</w:t>
+      </w:r>
+    </w:p>
+    <w:p>
+      <w:pPr>
+        <w:pStyle w:val="ListBullet"/>
+      </w:pPr>
+      <w:r>
+        <w:rPr>
+          <w:b/>
+        </w:rPr>
+        <w:t>Phiếu chi thử</w:t>
+      </w:r>
+      <w:r>
+        <w:t xml:space="preserve"> </w:t>
+      </w:r>
+      <w:r>
+        <w:rPr>
+          <w:rFonts w:ascii="Consolas" w:hAnsi="Consolas"/>
+          <w:sz w:val="19"/>
+        </w:rPr>
+        <w:t>1368-CTR-261001-…</w:t>
+      </w:r>
+      <w:r>
+        <w:t xml:space="preserve">, </w:t>
+      </w:r>
+      <w:r>
+        <w:rPr>
+          <w:rFonts w:ascii="Consolas" w:hAnsi="Consolas"/>
+          <w:sz w:val="19"/>
+        </w:rPr>
+        <w:t>1368-CKH-261001-00001</w:t>
+      </w:r>
+      <w:r>
+        <w:t xml:space="preserve">, </w:t>
+      </w:r>
+      <w:r>
+        <w:rPr>
+          <w:rFonts w:ascii="Consolas" w:hAnsi="Consolas"/>
+          <w:sz w:val="19"/>
+        </w:rPr>
+        <w:t>…00002</w:t>
+      </w:r>
+      <w:r>
+        <w:t>: phiếu chưa ghi sổ đã được rút.</w:t>
       </w:r>
     </w:p>
     <w:p>
@@ -1675,7 +2520,16 @@
               <w:t>/api/</w:t>
             </w:r>
             <w:r>
-              <w:t xml:space="preserve"> trang điều xe thật</w:t>
+              <w:t xml:space="preserve"> trang điều xe thật — </w:t>
+            </w:r>
+            <w:r>
+              <w:rPr>
+                <w:b/>
+              </w:rPr>
+              <w:t>bắt buộc</w:t>
+            </w:r>
+            <w:r>
+              <w:t>, thiếu thì màn Vụ việc báo 503</w:t>
             </w:r>
           </w:p>
         </w:tc>
@@ -1725,7 +2579,17 @@
           <w:p>
             <w:r/>
             <w:r>
-              <w:t>khoá Sếp tạo ở trang điều xe thật</w:t>
+              <w:t>khoá Sếp tạo ở trang điều xe thật (</w:t>
+            </w:r>
+            <w:r>
+              <w:rPr>
+                <w:rFonts w:ascii="Consolas" w:hAnsi="Consolas"/>
+                <w:sz w:val="19"/>
+              </w:rPr>
+              <w:t>POST /api/handover/tao-khoa</w:t>
+            </w:r>
+            <w:r>
+              <w:t>)</w:t>
             </w:r>
           </w:p>
         </w:tc>
@@ -1753,7 +2617,7 @@
                 <w:rFonts w:ascii="Consolas" w:hAnsi="Consolas"/>
                 <w:sz w:val="19"/>
               </w:rPr>
-              <w:t>LogisticsSalesPush:AllowedUserIds</w:t>
+              <w:t>LogisticsSource:Branches:&lt;BranchId&gt;</w:t>
             </w:r>
           </w:p>
         </w:tc>
@@ -1764,11 +2628,7 @@
           <w:p>
             <w:r/>
             <w:r>
-              <w:rPr>
-                <w:rFonts w:ascii="Consolas" w:hAnsi="Consolas"/>
-                <w:sz w:val="19"/>
-              </w:rPr>
-              <w:t>[846]</w:t>
+              <w:t>không đặt</w:t>
             </w:r>
           </w:p>
         </w:tc>
@@ -1779,6 +2639,70 @@
           <w:p>
             <w:r/>
             <w:r>
+              <w:t>chỉ khi chi nhánh có trang điều xe riêng</w:t>
+            </w:r>
+          </w:p>
+        </w:tc>
+      </w:tr>
+      <w:tr>
+        <w:tc>
+          <w:tcPr>
+            <w:tcW w:type="dxa" w:w="2160"/>
+          </w:tcPr>
+          <w:p>
+            <w:r/>
+            <w:r>
+              <w:t>API anh</w:t>
+            </w:r>
+          </w:p>
+        </w:tc>
+        <w:tc>
+          <w:tcPr>
+            <w:tcW w:type="dxa" w:w="2160"/>
+          </w:tcPr>
+          <w:p>
+            <w:r/>
+            <w:r>
+              <w:rPr>
+                <w:rFonts w:ascii="Consolas" w:hAnsi="Consolas"/>
+                <w:sz w:val="19"/>
+              </w:rPr>
+              <w:t>LogisticsSalesPush:Enabled</w:t>
+            </w:r>
+            <w:r>
+              <w:t xml:space="preserve">, </w:t>
+            </w:r>
+            <w:r>
+              <w:rPr>
+                <w:rFonts w:ascii="Consolas" w:hAnsi="Consolas"/>
+                <w:sz w:val="19"/>
+              </w:rPr>
+              <w:t>AllowedUserIds</w:t>
+            </w:r>
+          </w:p>
+        </w:tc>
+        <w:tc>
+          <w:tcPr>
+            <w:tcW w:type="dxa" w:w="2160"/>
+          </w:tcPr>
+          <w:p>
+            <w:r/>
+            <w:r>
+              <w:rPr>
+                <w:rFonts w:ascii="Consolas" w:hAnsi="Consolas"/>
+                <w:sz w:val="19"/>
+              </w:rPr>
+              <w:t>[846]</w:t>
+            </w:r>
+          </w:p>
+        </w:tc>
+        <w:tc>
+          <w:tcPr>
+            <w:tcW w:type="dxa" w:w="2160"/>
+          </w:tcPr>
+          <w:p>
+            <w:r/>
+            <w:r>
               <w:t xml:space="preserve">thêm </w:t>
             </w:r>
             <w:r>
@@ -1790,6 +2714,167 @@
             </w:r>
             <w:r>
               <w:t xml:space="preserve"> tài khoản tích hợp</w:t>
+            </w:r>
+          </w:p>
+        </w:tc>
+      </w:tr>
+      <w:tr>
+        <w:tc>
+          <w:tcPr>
+            <w:tcW w:type="dxa" w:w="2160"/>
+          </w:tcPr>
+          <w:p>
+            <w:r/>
+            <w:r>
+              <w:t>API anh</w:t>
+            </w:r>
+          </w:p>
+        </w:tc>
+        <w:tc>
+          <w:tcPr>
+            <w:tcW w:type="dxa" w:w="2160"/>
+          </w:tcPr>
+          <w:p>
+            <w:r/>
+            <w:r>
+              <w:rPr>
+                <w:rFonts w:ascii="Consolas" w:hAnsi="Consolas"/>
+                <w:sz w:val="19"/>
+              </w:rPr>
+              <w:t>LogisticsSalesPush:BusinessTypeId</w:t>
+            </w:r>
+            <w:r>
+              <w:t xml:space="preserve">, </w:t>
+            </w:r>
+            <w:r>
+              <w:rPr>
+                <w:rFonts w:ascii="Consolas" w:hAnsi="Consolas"/>
+                <w:sz w:val="19"/>
+              </w:rPr>
+              <w:t>AreaId</w:t>
+            </w:r>
+            <w:r>
+              <w:t xml:space="preserve">, </w:t>
+            </w:r>
+            <w:r>
+              <w:rPr>
+                <w:rFonts w:ascii="Consolas" w:hAnsi="Consolas"/>
+                <w:sz w:val="19"/>
+              </w:rPr>
+              <w:t>PosId</w:t>
+            </w:r>
+            <w:r>
+              <w:t xml:space="preserve">, </w:t>
+            </w:r>
+            <w:r>
+              <w:rPr>
+                <w:rFonts w:ascii="Consolas" w:hAnsi="Consolas"/>
+                <w:sz w:val="19"/>
+              </w:rPr>
+              <w:t>CounterId</w:t>
+            </w:r>
+            <w:r>
+              <w:t xml:space="preserve">, </w:t>
+            </w:r>
+            <w:r>
+              <w:rPr>
+                <w:rFonts w:ascii="Consolas" w:hAnsi="Consolas"/>
+                <w:sz w:val="19"/>
+              </w:rPr>
+              <w:t>TableId</w:t>
+            </w:r>
+          </w:p>
+        </w:tc>
+        <w:tc>
+          <w:tcPr>
+            <w:tcW w:type="dxa" w:w="2160"/>
+          </w:tcPr>
+          <w:p>
+            <w:r/>
+            <w:r>
+              <w:t>đủ năm mã</w:t>
+            </w:r>
+          </w:p>
+        </w:tc>
+        <w:tc>
+          <w:tcPr>
+            <w:tcW w:type="dxa" w:w="2160"/>
+          </w:tcPr>
+          <w:p>
+            <w:r/>
+            <w:r>
+              <w:t xml:space="preserve">thiếu một mã → 503 </w:t>
+            </w:r>
+            <w:r>
+              <w:rPr>
+                <w:rFonts w:ascii="Consolas" w:hAnsi="Consolas"/>
+                <w:sz w:val="19"/>
+              </w:rPr>
+              <w:t>LOGISTICS_CONFIG_REQUIRED</w:t>
+            </w:r>
+          </w:p>
+        </w:tc>
+      </w:tr>
+      <w:tr>
+        <w:tc>
+          <w:tcPr>
+            <w:tcW w:type="dxa" w:w="2160"/>
+          </w:tcPr>
+          <w:p>
+            <w:r/>
+            <w:r>
+              <w:t>WEB anh</w:t>
+            </w:r>
+          </w:p>
+        </w:tc>
+        <w:tc>
+          <w:tcPr>
+            <w:tcW w:type="dxa" w:w="2160"/>
+          </w:tcPr>
+          <w:p>
+            <w:r/>
+            <w:r>
+              <w:rPr>
+                <w:rFonts w:ascii="Consolas" w:hAnsi="Consolas"/>
+                <w:sz w:val="19"/>
+              </w:rPr>
+              <w:t>BACKOFFICE_API_URL</w:t>
+            </w:r>
+          </w:p>
+        </w:tc>
+        <w:tc>
+          <w:tcPr>
+            <w:tcW w:type="dxa" w:w="2160"/>
+          </w:tcPr>
+          <w:p>
+            <w:r/>
+            <w:r>
+              <w:rPr>
+                <w:rFonts w:ascii="Consolas" w:hAnsi="Consolas"/>
+                <w:sz w:val="19"/>
+              </w:rPr>
+              <w:t>Env=laoslocal</w:t>
+            </w:r>
+            <w:r>
+              <w:t xml:space="preserve"> trỏ 5090</w:t>
+            </w:r>
+          </w:p>
+        </w:tc>
+        <w:tc>
+          <w:tcPr>
+            <w:tcW w:type="dxa" w:w="2160"/>
+          </w:tcPr>
+          <w:p>
+            <w:r/>
+            <w:r>
+              <w:rPr>
+                <w:rFonts w:ascii="Consolas" w:hAnsi="Consolas"/>
+                <w:sz w:val="19"/>
+              </w:rPr>
+              <w:t>Env=laos</w:t>
+            </w:r>
+            <w:r>
+              <w:t xml:space="preserve"> trỏ API host</w:t>
             </w:r>
           </w:p>
         </w:tc>
@@ -1953,19 +3038,10 @@
               <w:rPr>
                 <w:b/>
               </w:rPr>
-              <w:t>Bút toán chi phí thuê xe</w:t>
-            </w:r>
-            <w:r>
-              <w:t xml:space="preserve"> </w:t>
-            </w:r>
-            <w:r>
-              <w:rPr>
-                <w:i/>
-              </w:rPr>
-              <w:t>Nợ 621 / Có 4022</w:t>
-            </w:r>
-            <w:r>
-              <w:t xml:space="preserve"> (không qua tiền)</w:t>
+              <w:t>API bút toán</w:t>
+            </w:r>
+            <w:r>
+              <w:t xml:space="preserve"> (không qua tiền) cho mọi bút toán chờ gửi: thuê xe 621/4022, ghi nợ nhà cung cấp 625 · 614 / 4021, quyết toán tạm ứng 625/1601</w:t>
             </w:r>
           </w:p>
         </w:tc>
@@ -1976,7 +3052,7 @@
           <w:p>
             <w:r/>
             <w:r>
-              <w:t xml:space="preserve">Source chưa có chứng từ bút toán tổng hợp; định nghĩa thủ tục sổ cái chỉ nằm trong DB. Bên em đề nghị đường </w:t>
+              <w:t xml:space="preserve">Source chưa có chứng từ bút toán tổng hợp; định nghĩa thủ tục sổ cái chỉ nằm trong DB. Đề nghị </w:t>
             </w:r>
             <w:r>
               <w:rPr>
@@ -1996,7 +3072,7 @@
               <w:t>/reverse</w:t>
             </w:r>
             <w:r>
-              <w:t>), xem hợp đồng 12.12.4.</w:t>
+              <w:t>), khoá chống trùng theo nguồn; hợp đồng 12.12.4</w:t>
             </w:r>
           </w:p>
         </w:tc>
@@ -2007,7 +3083,7 @@
           <w:p>
             <w:r/>
             <w:r>
-              <w:t xml:space="preserve">bên em làm khi đọc được cấu trúc sổ cái (chủ dự án cấp quyền đọc DB, hoặc anh gửi định nghĩa </w:t>
+              <w:t xml:space="preserve">anh duyệt, hoặc gửi định nghĩa </w:t>
             </w:r>
             <w:r>
               <w:rPr>
@@ -2017,7 +3093,7 @@
               <w:t>sp_PostTing_GeneralLedger</w:t>
             </w:r>
             <w:r>
-              <w:t>)</w:t>
+              <w:t xml:space="preserve"> (hay chủ dự án cấp quyền đọc DB) để bên em viết</w:t>
             </w:r>
           </w:p>
         </w:tc>
@@ -2033,7 +3109,7 @@
               <w:rPr>
                 <w:b/>
               </w:rPr>
-              <w:t>Tài khoản tích hợp</w:t>
+              <w:t>Huỷ hai SO thử</w:t>
             </w:r>
             <w:r>
               <w:t xml:space="preserve"> </w:t>
@@ -2043,10 +3119,17 @@
                 <w:rFonts w:ascii="Consolas" w:hAnsi="Consolas"/>
                 <w:sz w:val="19"/>
               </w:rPr>
-              <w:t>epl_logistics</w:t>
-            </w:r>
-            <w:r>
-              <w:t xml:space="preserve"> thay token cá nhân</w:t>
+              <w:t>…162</w:t>
+            </w:r>
+            <w:r>
+              <w:t xml:space="preserve">, </w:t>
+            </w:r>
+            <w:r>
+              <w:rPr>
+                <w:rFonts w:ascii="Consolas" w:hAnsi="Consolas"/>
+                <w:sz w:val="19"/>
+              </w:rPr>
+              <w:t>…163</w:t>
             </w:r>
           </w:p>
         </w:tc>
@@ -2057,27 +3140,7 @@
           <w:p>
             <w:r/>
             <w:r>
-              <w:t xml:space="preserve">Tệp tạo đã sẵn: nhân viên </w:t>
-            </w:r>
-            <w:r>
-              <w:rPr>
-                <w:rFonts w:ascii="Consolas" w:hAnsi="Consolas"/>
-                <w:sz w:val="19"/>
-              </w:rPr>
-              <w:t>EPL-TICHHOP</w:t>
-            </w:r>
-            <w:r>
-              <w:t xml:space="preserve"> chi nhánh 1368, cùng nhóm quyền người gửi hiện nay, mật khẩu chỉ nằm trong </w:t>
-            </w:r>
-            <w:r>
-              <w:rPr>
-                <w:rFonts w:ascii="Consolas" w:hAnsi="Consolas"/>
-                <w:sz w:val="19"/>
-              </w:rPr>
-              <w:t>.env</w:t>
-            </w:r>
-            <w:r>
-              <w:t>. Chủ dự án chạy tệp.</w:t>
+              <w:t>dữ liệu thử</w:t>
             </w:r>
           </w:p>
         </w:tc>
@@ -2088,17 +3151,17 @@
           <w:p>
             <w:r/>
             <w:r>
-              <w:t xml:space="preserve">chủ dự án chạy; anh thêm </w:t>
+              <w:t xml:space="preserve">anh. Huỷ xong, anh cho bên em biết gửi lại hai DO đó thế nào: khoá chống trùng cũ </w:t>
             </w:r>
             <w:r>
               <w:rPr>
                 <w:rFonts w:ascii="Consolas" w:hAnsi="Consolas"/>
                 <w:sz w:val="19"/>
               </w:rPr>
-              <w:t>UserId</w:t>
-            </w:r>
-            <w:r>
-              <w:t xml:space="preserve"> vào cấu hình host</w:t>
+              <w:t>logistics:EPLLAO-&lt;Trip.id&gt;</w:t>
+            </w:r>
+            <w:r>
+              <w:t xml:space="preserve"> vẫn còn bên anh</w:t>
             </w:r>
           </w:p>
         </w:tc>
@@ -2114,20 +3177,20 @@
               <w:rPr>
                 <w:b/>
               </w:rPr>
-              <w:t>Tiền USD</w:t>
-            </w:r>
-            <w:r>
-              <w:t xml:space="preserve"> (</w:t>
+              <w:t>Tài khoản tích hợp</w:t>
+            </w:r>
+            <w:r>
+              <w:t xml:space="preserve"> </w:t>
             </w:r>
             <w:r>
               <w:rPr>
                 <w:rFonts w:ascii="Consolas" w:hAnsi="Consolas"/>
                 <w:sz w:val="19"/>
               </w:rPr>
-              <w:t>CurrencyId</w:t>
-            </w:r>
-            <w:r>
-              <w:t xml:space="preserve"> 2) đang tắt</w:t>
+              <w:t>epl_logistics</w:t>
+            </w:r>
+            <w:r>
+              <w:t xml:space="preserve"> thay token cá nhân (hết hạn 10/10/2026)</w:t>
             </w:r>
           </w:p>
         </w:tc>
@@ -2138,14 +3201,27 @@
           <w:p>
             <w:r/>
             <w:r>
-              <w:t xml:space="preserve">Bên em tạm đặt </w:t>
+              <w:t xml:space="preserve">Tệp tạo đã sẵn: nhân viên </w:t>
             </w:r>
             <w:r>
               <w:rPr>
                 <w:rFonts w:ascii="Consolas" w:hAnsi="Consolas"/>
                 <w:sz w:val="19"/>
               </w:rPr>
-              <w:t>QLSX_TIEN_USD=2</w:t>
+              <w:t>EPL-TICHHOP</w:t>
+            </w:r>
+            <w:r>
+              <w:t xml:space="preserve"> chi nhánh 1368, cùng nhóm quyền người gửi hiện nay, mật khẩu chỉ nằm trong </w:t>
+            </w:r>
+            <w:r>
+              <w:rPr>
+                <w:rFonts w:ascii="Consolas" w:hAnsi="Consolas"/>
+                <w:sz w:val="19"/>
+              </w:rPr>
+              <w:t>.env</w:t>
+            </w:r>
+            <w:r>
+              <w:t>. Chủ dự án chạy tệp</w:t>
             </w:r>
           </w:p>
         </w:tc>
@@ -2156,7 +3232,17 @@
           <w:p>
             <w:r/>
             <w:r>
-              <w:t>anh bật trong danh mục tiền tệ</w:t>
+              <w:t xml:space="preserve">chủ dự án chạy; anh thêm </w:t>
+            </w:r>
+            <w:r>
+              <w:rPr>
+                <w:rFonts w:ascii="Consolas" w:hAnsi="Consolas"/>
+                <w:sz w:val="19"/>
+              </w:rPr>
+              <w:t>UserId</w:t>
+            </w:r>
+            <w:r>
+              <w:t xml:space="preserve"> vào cấu hình host</w:t>
             </w:r>
           </w:p>
         </w:tc>
@@ -2169,25 +3255,23 @@
           <w:p>
             <w:r/>
             <w:r>
-              <w:t xml:space="preserve">Bút toán riêng cho </w:t>
-            </w:r>
-            <w:r>
               <w:rPr>
                 <w:b/>
               </w:rPr>
-              <w:t>phí 2 %</w:t>
-            </w:r>
-            <w:r>
-              <w:t xml:space="preserve"> và </w:t>
+              <w:t>Cờ phân loại loại chứng từ</w:t>
+            </w:r>
+            <w:r>
+              <w:t xml:space="preserve"> ở </w:t>
             </w:r>
             <w:r>
               <w:rPr>
-                <w:b/>
+                <w:rFonts w:ascii="Consolas" w:hAnsi="Consolas"/>
+                <w:sz w:val="19"/>
               </w:rPr>
-              <w:t>trừ quá tải</w:t>
-            </w:r>
-            <w:r>
-              <w:t xml:space="preserve"> xe thuê</w:t>
+              <w:t>document-types</w:t>
+            </w:r>
+            <w:r>
+              <w:t xml:space="preserve"> (công nợ / khác / "Chi trước")</w:t>
             </w:r>
           </w:p>
         </w:tc>
@@ -2198,7 +3282,7 @@
           <w:p>
             <w:r/>
             <w:r>
-              <w:t>chưa có tài khoản</w:t>
+              <w:t>WEB và API đang ghi cứng 58/60, 15/17; phiếu "Chi trước" (59) tạm ứng bên em tạo không có trong ô chọn của WEB</w:t>
             </w:r>
           </w:p>
         </w:tc>
@@ -2209,7 +3293,7 @@
           <w:p>
             <w:r/>
             <w:r>
-              <w:t>anh Khampla chốt</w:t>
+              <w:t>anh</w:t>
             </w:r>
           </w:p>
         </w:tc>
@@ -2222,7 +3306,23 @@
           <w:p>
             <w:r/>
             <w:r>
-              <w:t>Màn "Tài khoản" ở hồ sơ nhân viên bên WEB</w:t>
+              <w:rPr>
+                <w:b/>
+              </w:rPr>
+              <w:t>Tiền USD</w:t>
+            </w:r>
+            <w:r>
+              <w:t xml:space="preserve"> (</w:t>
+            </w:r>
+            <w:r>
+              <w:rPr>
+                <w:rFonts w:ascii="Consolas" w:hAnsi="Consolas"/>
+                <w:sz w:val="19"/>
+              </w:rPr>
+              <w:t>CurrencyId</w:t>
+            </w:r>
+            <w:r>
+              <w:t xml:space="preserve"> 2) đang tắt</w:t>
             </w:r>
           </w:p>
         </w:tc>
@@ -2233,14 +3333,14 @@
           <w:p>
             <w:r/>
             <w:r>
-              <w:t xml:space="preserve">chưa nối API </w:t>
+              <w:t xml:space="preserve">Bên em tạm đặt </w:t>
             </w:r>
             <w:r>
               <w:rPr>
                 <w:rFonts w:ascii="Consolas" w:hAnsi="Consolas"/>
                 <w:sz w:val="19"/>
               </w:rPr>
-              <w:t>account/upsert</w:t>
+              <w:t>QLSX_TIEN_USD=2</w:t>
             </w:r>
           </w:p>
         </w:tc>
@@ -2251,7 +3351,205 @@
           <w:p>
             <w:r/>
             <w:r>
+              <w:t>anh bật trong danh mục tiền tệ</w:t>
+            </w:r>
+          </w:p>
+        </w:tc>
+      </w:tr>
+      <w:tr>
+        <w:tc>
+          <w:tcPr>
+            <w:tcW w:type="dxa" w:w="2880"/>
+          </w:tcPr>
+          <w:p>
+            <w:r/>
+            <w:r>
+              <w:rPr>
+                <w:b/>
+              </w:rPr>
+              <w:t>Log kiểm toán</w:t>
+            </w:r>
+            <w:r>
+              <w:t xml:space="preserve"> "Đặt log sai" (</w:t>
+            </w:r>
+            <w:r>
+              <w:rPr>
+                <w:rFonts w:ascii="Consolas" w:hAnsi="Consolas"/>
+                <w:sz w:val="19"/>
+              </w:rPr>
+              <w:t>ApiAuditAutoLogFilter.cs:27</w:t>
+            </w:r>
+            <w:r>
+              <w:t>)</w:t>
+            </w:r>
+          </w:p>
+        </w:tc>
+        <w:tc>
+          <w:tcPr>
+            <w:tcW w:type="dxa" w:w="2880"/>
+          </w:tcPr>
+          <w:p>
+            <w:r/>
+            <w:r>
+              <w:t>lệnh vẫn chạy, nhật ký không ghi</w:t>
+            </w:r>
+          </w:p>
+        </w:tc>
+        <w:tc>
+          <w:tcPr>
+            <w:tcW w:type="dxa" w:w="2880"/>
+          </w:tcPr>
+          <w:p>
+            <w:r/>
+            <w:r>
+              <w:t>anh xem</w:t>
+            </w:r>
+          </w:p>
+        </w:tc>
+      </w:tr>
+      <w:tr>
+        <w:tc>
+          <w:tcPr>
+            <w:tcW w:type="dxa" w:w="2880"/>
+          </w:tcPr>
+          <w:p>
+            <w:r/>
+            <w:r>
+              <w:t xml:space="preserve">Bút toán riêng cho </w:t>
+            </w:r>
+            <w:r>
+              <w:rPr>
+                <w:b/>
+              </w:rPr>
+              <w:t>phí 2 %</w:t>
+            </w:r>
+            <w:r>
+              <w:t xml:space="preserve"> và </w:t>
+            </w:r>
+            <w:r>
+              <w:rPr>
+                <w:b/>
+              </w:rPr>
+              <w:t>trừ quá tải</w:t>
+            </w:r>
+            <w:r>
+              <w:t xml:space="preserve"> xe thuê</w:t>
+            </w:r>
+          </w:p>
+        </w:tc>
+        <w:tc>
+          <w:tcPr>
+            <w:tcW w:type="dxa" w:w="2880"/>
+          </w:tcPr>
+          <w:p>
+            <w:r/>
+            <w:r>
+              <w:t>chưa có tài khoản</w:t>
+            </w:r>
+          </w:p>
+        </w:tc>
+        <w:tc>
+          <w:tcPr>
+            <w:tcW w:type="dxa" w:w="2880"/>
+          </w:tcPr>
+          <w:p>
+            <w:r/>
+            <w:r>
+              <w:t>anh Khampla chốt</w:t>
+            </w:r>
+          </w:p>
+        </w:tc>
+      </w:tr>
+      <w:tr>
+        <w:tc>
+          <w:tcPr>
+            <w:tcW w:type="dxa" w:w="2880"/>
+          </w:tcPr>
+          <w:p>
+            <w:r/>
+            <w:r>
+              <w:t>Màn "Tài khoản" ở hồ sơ nhân viên bên WEB</w:t>
+            </w:r>
+          </w:p>
+        </w:tc>
+        <w:tc>
+          <w:tcPr>
+            <w:tcW w:type="dxa" w:w="2880"/>
+          </w:tcPr>
+          <w:p>
+            <w:r/>
+            <w:r>
+              <w:t xml:space="preserve">chưa nối API </w:t>
+            </w:r>
+            <w:r>
+              <w:rPr>
+                <w:rFonts w:ascii="Consolas" w:hAnsi="Consolas"/>
+                <w:sz w:val="19"/>
+              </w:rPr>
+              <w:t>account/upsert</w:t>
+            </w:r>
+          </w:p>
+        </w:tc>
+        <w:tc>
+          <w:tcPr>
+            <w:tcW w:type="dxa" w:w="2880"/>
+          </w:tcPr>
+          <w:p>
+            <w:r/>
+            <w:r>
               <w:t>anh</w:t>
+            </w:r>
+          </w:p>
+        </w:tc>
+      </w:tr>
+      <w:tr>
+        <w:tc>
+          <w:tcPr>
+            <w:tcW w:type="dxa" w:w="2880"/>
+          </w:tcPr>
+          <w:p>
+            <w:r/>
+            <w:r>
+              <w:t xml:space="preserve">Chạy lại vòng nối kế toán với </w:t>
+            </w:r>
+            <w:r>
+              <w:rPr>
+                <w:rFonts w:ascii="Consolas" w:hAnsi="Consolas"/>
+                <w:sz w:val="19"/>
+              </w:rPr>
+              <w:t>ce95b3c</w:t>
+            </w:r>
+          </w:p>
+        </w:tc>
+        <w:tc>
+          <w:tcPr>
+            <w:tcW w:type="dxa" w:w="2880"/>
+          </w:tcPr>
+          <w:p>
+            <w:r/>
+            <w:r>
+              <w:t xml:space="preserve">8 bài đạt trên </w:t>
+            </w:r>
+            <w:r>
+              <w:rPr>
+                <w:rFonts w:ascii="Consolas" w:hAnsi="Consolas"/>
+                <w:sz w:val="19"/>
+              </w:rPr>
+              <w:t>64ce7a4</w:t>
+            </w:r>
+            <w:r>
+              <w:t>; tổng header nay máy chủ tính</w:t>
+            </w:r>
+          </w:p>
+        </w:tc>
+        <w:tc>
+          <w:tcPr>
+            <w:tcW w:type="dxa" w:w="2880"/>
+          </w:tcPr>
+          <w:p>
+            <w:r/>
+            <w:r>
+              <w:t>bên em</w:t>
             </w:r>
           </w:p>
         </w:tc>
@@ -2302,7 +3600,7 @@
         <w:pStyle w:val="ListBullet"/>
       </w:pPr>
       <w:r>
-        <w:t xml:space="preserve">Bảng nối API: </w:t>
+        <w:t xml:space="preserve">Bản đồ nối API: </w:t>
       </w:r>
       <w:r>
         <w:rPr>
@@ -2399,6 +3697,21 @@
           <w:sz w:val="19"/>
         </w:rPr>
         <w:t>kiem/thu_dinh_khoan.py</w:t>
+      </w:r>
+    </w:p>
+    <w:p>
+      <w:pPr>
+        <w:pStyle w:val="ListBullet2"/>
+      </w:pPr>
+      <w:r>
+        <w:rPr>
+          <w:rFonts w:ascii="Consolas" w:hAnsi="Consolas"/>
+          <w:sz w:val="19"/>
+        </w:rPr>
+        <w:t>kiem/thu_tat_toan_tune.py</w:t>
+      </w:r>
+      <w:r>
+        <w:t xml:space="preserve"> (đang làm, cùng phần tất toán / trả nhà cung cấp)</w:t>
       </w:r>
     </w:p>
     <w:sectPr>

</xml_diff>